<commit_message>
Bugfixes, added glutine table
</commit_message>
<xml_diff>
--- a/static/Referto_Ageing.docx
+++ b/static/Referto_Ageing.docx
@@ -281,8 +281,8 @@
       </w:tblPr>
       <w:tblGrid>
         <w:gridCol w:w="3320"/>
-        <w:gridCol w:w="3237"/>
-        <w:gridCol w:w="3613"/>
+        <w:gridCol w:w="3234"/>
+        <w:gridCol w:w="3616"/>
       </w:tblGrid>
       <w:tr>
         <w:trPr>
@@ -354,7 +354,7 @@
         </w:tc>
         <w:tc>
           <w:tcPr>
-            <w:tcW w:w="3237" w:type="dxa"/>
+            <w:tcW w:w="3234" w:type="dxa"/>
             <w:tcBorders>
               <w:top w:val="nil"/>
               <w:left w:val="nil"/>
@@ -417,7 +417,7 @@
         </w:tc>
         <w:tc>
           <w:tcPr>
-            <w:tcW w:w="3613" w:type="dxa"/>
+            <w:tcW w:w="3616" w:type="dxa"/>
             <w:tcBorders>
               <w:top w:val="nil"/>
               <w:left w:val="nil"/>
@@ -543,7 +543,7 @@
         </w:tc>
         <w:tc>
           <w:tcPr>
-            <w:tcW w:w="3237" w:type="dxa"/>
+            <w:tcW w:w="3234" w:type="dxa"/>
             <w:tcBorders>
               <w:top w:val="nil"/>
               <w:left w:val="nil"/>
@@ -605,7 +605,7 @@
         </w:tc>
         <w:tc>
           <w:tcPr>
-            <w:tcW w:w="3613" w:type="dxa"/>
+            <w:tcW w:w="3616" w:type="dxa"/>
             <w:tcBorders>
               <w:top w:val="nil"/>
               <w:left w:val="nil"/>
@@ -719,7 +719,7 @@
         </w:tc>
         <w:tc>
           <w:tcPr>
-            <w:tcW w:w="3237" w:type="dxa"/>
+            <w:tcW w:w="3234" w:type="dxa"/>
             <w:tcBorders>
               <w:top w:val="nil"/>
               <w:left w:val="nil"/>
@@ -794,7 +794,7 @@
         </w:tc>
         <w:tc>
           <w:tcPr>
-            <w:tcW w:w="3613" w:type="dxa"/>
+            <w:tcW w:w="3616" w:type="dxa"/>
             <w:tcBorders>
               <w:top w:val="nil"/>
               <w:left w:val="nil"/>
@@ -7526,9 +7526,9 @@
         <w:tblLook w:val="04a0" w:noHBand="0" w:noVBand="1" w:firstColumn="1" w:lastRow="0" w:lastColumn="0" w:firstRow="1"/>
       </w:tblPr>
       <w:tblGrid>
-        <w:gridCol w:w="1618"/>
-        <w:gridCol w:w="2322"/>
-        <w:gridCol w:w="1622"/>
+        <w:gridCol w:w="1616"/>
+        <w:gridCol w:w="2321"/>
+        <w:gridCol w:w="1625"/>
         <w:gridCol w:w="2355"/>
         <w:gridCol w:w="2614"/>
       </w:tblGrid>
@@ -7538,7 +7538,7 @@
         </w:trPr>
         <w:tc>
           <w:tcPr>
-            <w:tcW w:w="1618" w:type="dxa"/>
+            <w:tcW w:w="1616" w:type="dxa"/>
             <w:tcBorders>
               <w:right w:val="nil"/>
             </w:tcBorders>
@@ -7578,7 +7578,7 @@
         </w:tc>
         <w:tc>
           <w:tcPr>
-            <w:tcW w:w="2322" w:type="dxa"/>
+            <w:tcW w:w="2321" w:type="dxa"/>
             <w:tcBorders/>
             <w:shd w:color="auto" w:fill="808080" w:themeFill="background1" w:themeFillShade="80" w:val="clear"/>
           </w:tcPr>
@@ -7614,7 +7614,7 @@
         </w:tc>
         <w:tc>
           <w:tcPr>
-            <w:tcW w:w="6591" w:type="dxa"/>
+            <w:tcW w:w="6594" w:type="dxa"/>
             <w:gridSpan w:val="3"/>
             <w:tcBorders/>
             <w:shd w:color="auto" w:fill="808080" w:themeFill="background1" w:themeFillShade="80" w:val="clear"/>
@@ -7658,7 +7658,7 @@
         </w:trPr>
         <w:tc>
           <w:tcPr>
-            <w:tcW w:w="1618" w:type="dxa"/>
+            <w:tcW w:w="1616" w:type="dxa"/>
             <w:tcBorders>
               <w:right w:val="nil"/>
             </w:tcBorders>
@@ -7684,7 +7684,7 @@
         </w:tc>
         <w:tc>
           <w:tcPr>
-            <w:tcW w:w="2322" w:type="dxa"/>
+            <w:tcW w:w="2321" w:type="dxa"/>
             <w:tcBorders/>
           </w:tcPr>
           <w:p>
@@ -7708,7 +7708,7 @@
         </w:tc>
         <w:tc>
           <w:tcPr>
-            <w:tcW w:w="1622" w:type="dxa"/>
+            <w:tcW w:w="1625" w:type="dxa"/>
             <w:tcBorders/>
           </w:tcPr>
           <w:p>
@@ -10608,19 +10608,15 @@
           </w:tcPr>
           <w:p>
             <w:pPr>
-              <w:pStyle w:val="BodyText"/>
-              <w:widowControl w:val="false"/>
-              <w:suppressAutoHyphens w:val="true"/>
-              <w:spacing w:before="74" w:after="0"/>
-              <w:ind w:hanging="0" w:left="0"/>
-              <w:jc w:val="center"/>
-              <w:rPr>
-                <w:lang w:val="it-IT"/>
+              <w:pStyle w:val="Normal"/>
+              <w:jc w:val="left"/>
+              <w:rPr>
+                <w:sz w:val="20"/>
               </w:rPr>
             </w:pPr>
             <w:r>
               <w:rPr>
-                <w:lang w:val="it-IT"/>
+                <w:sz w:val="20"/>
               </w:rPr>
             </w:r>
           </w:p>
@@ -10630,22 +10626,327 @@
     <w:p>
       <w:pPr>
         <w:pStyle w:val="Normal"/>
-        <w:rPr>
-          <w:b w:val="false"/>
-          <w:bCs w:val="false"/>
-          <w:spacing w:val="-8"/>
-          <w:lang w:val="it-IT"/>
-        </w:rPr>
+        <w:rPr/>
       </w:pPr>
       <w:r>
-        <w:rPr>
-          <w:b w:val="false"/>
-          <w:bCs w:val="false"/>
-          <w:spacing w:val="-8"/>
-          <w:lang w:val="it-IT"/>
-        </w:rPr>
+        <w:rPr/>
       </w:r>
     </w:p>
+    <w:tbl>
+      <w:tblPr>
+        <w:tblStyle w:val="TableGrid"/>
+        <w:tblW w:w="10350" w:type="dxa"/>
+        <w:jc w:val="left"/>
+        <w:tblInd w:w="108" w:type="dxa"/>
+        <w:tblLayout w:type="fixed"/>
+        <w:tblCellMar>
+          <w:top w:w="0" w:type="dxa"/>
+          <w:left w:w="108" w:type="dxa"/>
+          <w:bottom w:w="0" w:type="dxa"/>
+          <w:right w:w="108" w:type="dxa"/>
+        </w:tblCellMar>
+        <w:tblLook w:val="04a0" w:noHBand="0" w:noVBand="1" w:firstColumn="1" w:lastRow="0" w:lastColumn="0" w:firstRow="1"/>
+      </w:tblPr>
+      <w:tblGrid>
+        <w:gridCol w:w="1789"/>
+        <w:gridCol w:w="2050"/>
+        <w:gridCol w:w="2160"/>
+        <w:gridCol w:w="1913"/>
+        <w:gridCol w:w="2438"/>
+      </w:tblGrid>
+      <w:tr>
+        <w:trPr>
+          <w:trHeight w:val="454" w:hRule="atLeast"/>
+        </w:trPr>
+        <w:tc>
+          <w:tcPr>
+            <w:tcW w:w="1789" w:type="dxa"/>
+            <w:tcBorders>
+              <w:top w:val="single" w:sz="4" w:space="0" w:color="000000"/>
+              <w:left w:val="single" w:sz="4" w:space="0" w:color="000000"/>
+              <w:bottom w:val="single" w:sz="4" w:space="0" w:color="000000"/>
+              <w:right w:val="single" w:sz="4" w:space="0" w:color="000000"/>
+            </w:tcBorders>
+            <w:shd w:color="auto" w:fill="808080" w:themeFill="background1" w:themeFillShade="80" w:val="clear"/>
+          </w:tcPr>
+          <w:p>
+            <w:pPr>
+              <w:pStyle w:val="BodyText"/>
+              <w:suppressAutoHyphens w:val="true"/>
+              <w:spacing w:before="74" w:after="0"/>
+              <w:ind w:hanging="0" w:left="0"/>
+              <w:jc w:val="center"/>
+              <w:rPr>
+                <w:rFonts w:ascii="Arial" w:hAnsi="Arial"/>
+              </w:rPr>
+            </w:pPr>
+            <w:r>
+              <w:rPr>
+                <w:rFonts w:cs="" w:ascii="Arial" w:hAnsi="Arial"/>
+                <w:b/>
+                <w:bCs/>
+                <w:color w:themeColor="background1" w:val="FFFFFF"/>
+                <w:kern w:val="0"/>
+                <w:sz w:val="24"/>
+                <w:szCs w:val="24"/>
+                <w:lang w:val="it-IT" w:eastAsia="en-US" w:bidi="ar-SA"/>
+              </w:rPr>
+              <w:t>GENE</w:t>
+            </w:r>
+          </w:p>
+        </w:tc>
+        <w:tc>
+          <w:tcPr>
+            <w:tcW w:w="6123" w:type="dxa"/>
+            <w:gridSpan w:val="3"/>
+            <w:tcBorders>
+              <w:top w:val="single" w:sz="4" w:space="0" w:color="000000"/>
+              <w:left w:val="single" w:sz="4" w:space="0" w:color="000000"/>
+              <w:bottom w:val="single" w:sz="4" w:space="0" w:color="000000"/>
+              <w:right w:val="single" w:sz="4" w:space="0" w:color="000000"/>
+            </w:tcBorders>
+            <w:shd w:color="auto" w:fill="808080" w:themeFill="background1" w:themeFillShade="80" w:val="clear"/>
+          </w:tcPr>
+          <w:p>
+            <w:pPr>
+              <w:pStyle w:val="BodyText"/>
+              <w:suppressAutoHyphens w:val="true"/>
+              <w:spacing w:before="74" w:after="0"/>
+              <w:ind w:hanging="0" w:left="0"/>
+              <w:jc w:val="center"/>
+              <w:rPr>
+                <w:rFonts w:ascii="Arial" w:hAnsi="Arial"/>
+              </w:rPr>
+            </w:pPr>
+            <w:r>
+              <w:rPr>
+                <w:rFonts w:cs="" w:ascii="Arial" w:hAnsi="Arial"/>
+                <w:b/>
+                <w:bCs/>
+                <w:color w:themeColor="background1" w:val="FFFFFF"/>
+                <w:kern w:val="0"/>
+                <w:sz w:val="24"/>
+                <w:szCs w:val="24"/>
+                <w:lang w:val="it-IT" w:eastAsia="en-US" w:bidi="ar-SA"/>
+              </w:rPr>
+              <w:t>ALLELE</w:t>
+            </w:r>
+          </w:p>
+        </w:tc>
+        <w:tc>
+          <w:tcPr>
+            <w:tcW w:w="2438" w:type="dxa"/>
+            <w:tcBorders>
+              <w:top w:val="single" w:sz="4" w:space="0" w:color="000000"/>
+              <w:left w:val="single" w:sz="4" w:space="0" w:color="000000"/>
+              <w:bottom w:val="single" w:sz="4" w:space="0" w:color="000000"/>
+              <w:right w:val="single" w:sz="4" w:space="0" w:color="000000"/>
+            </w:tcBorders>
+            <w:shd w:color="auto" w:fill="808080" w:themeFill="background1" w:themeFillShade="80" w:val="clear"/>
+          </w:tcPr>
+          <w:p>
+            <w:pPr>
+              <w:pStyle w:val="BodyText"/>
+              <w:suppressAutoHyphens w:val="true"/>
+              <w:spacing w:before="74" w:after="0"/>
+              <w:ind w:hanging="0" w:left="0"/>
+              <w:jc w:val="center"/>
+              <w:rPr>
+                <w:rFonts w:ascii="Arial" w:hAnsi="Arial"/>
+              </w:rPr>
+            </w:pPr>
+            <w:r>
+              <w:rPr>
+                <w:rFonts w:cs="" w:ascii="Arial" w:hAnsi="Arial"/>
+                <w:b/>
+                <w:bCs/>
+                <w:color w:themeColor="background1" w:val="FFFFFF"/>
+                <w:kern w:val="0"/>
+                <w:sz w:val="24"/>
+                <w:szCs w:val="24"/>
+                <w:lang w:val="it-IT" w:eastAsia="en-US" w:bidi="ar-SA"/>
+              </w:rPr>
+              <w:t>MICRONUTRIENTE</w:t>
+            </w:r>
+          </w:p>
+        </w:tc>
+      </w:tr>
+      <w:tr>
+        <w:trPr>
+          <w:trHeight w:val="436" w:hRule="atLeast"/>
+        </w:trPr>
+        <w:tc>
+          <w:tcPr>
+            <w:tcW w:w="1789" w:type="dxa"/>
+            <w:tcBorders>
+              <w:top w:val="single" w:sz="4" w:space="0" w:color="000000"/>
+              <w:left w:val="single" w:sz="4" w:space="0" w:color="000000"/>
+              <w:bottom w:val="single" w:sz="4" w:space="0" w:color="000000"/>
+              <w:right w:val="single" w:sz="4" w:space="0" w:color="000000"/>
+            </w:tcBorders>
+            <w:vAlign w:val="center"/>
+          </w:tcPr>
+          <w:p>
+            <w:pPr>
+              <w:pStyle w:val="BodyText"/>
+              <w:suppressAutoHyphens w:val="true"/>
+              <w:spacing w:before="74" w:after="0"/>
+              <w:ind w:hanging="0" w:left="0"/>
+              <w:jc w:val="center"/>
+              <w:rPr>
+                <w:rFonts w:ascii="Arial" w:hAnsi="Arial"/>
+                <w:lang w:val="it-IT"/>
+              </w:rPr>
+            </w:pPr>
+            <w:r>
+              <w:rPr>
+                <w:rFonts w:ascii="Arial" w:hAnsi="Arial"/>
+                <w:lang w:val="it-IT"/>
+              </w:rPr>
+            </w:r>
+          </w:p>
+        </w:tc>
+        <w:tc>
+          <w:tcPr>
+            <w:tcW w:w="2050" w:type="dxa"/>
+            <w:tcBorders>
+              <w:top w:val="single" w:sz="4" w:space="0" w:color="000000"/>
+              <w:left w:val="single" w:sz="4" w:space="0" w:color="000000"/>
+              <w:bottom w:val="single" w:sz="4" w:space="0" w:color="000000"/>
+              <w:right w:val="single" w:sz="4" w:space="0" w:color="000000"/>
+            </w:tcBorders>
+            <w:vAlign w:val="center"/>
+          </w:tcPr>
+          <w:p>
+            <w:pPr>
+              <w:pStyle w:val="BodyText"/>
+              <w:suppressAutoHyphens w:val="true"/>
+              <w:spacing w:before="74" w:after="0"/>
+              <w:ind w:hanging="0" w:left="0"/>
+              <w:jc w:val="center"/>
+              <w:rPr>
+                <w:rFonts w:ascii="Arial" w:hAnsi="Arial"/>
+              </w:rPr>
+            </w:pPr>
+            <w:r>
+              <w:rPr>
+                <w:rFonts w:cs="" w:ascii="Arial" w:hAnsi="Arial"/>
+                <w:b/>
+                <w:bCs/>
+                <w:kern w:val="0"/>
+                <w:sz w:val="22"/>
+                <w:szCs w:val="22"/>
+                <w:lang w:val="it-IT" w:eastAsia="en-US" w:bidi="ar-SA"/>
+              </w:rPr>
+              <w:t>NORMALE</w:t>
+            </w:r>
+          </w:p>
+        </w:tc>
+        <w:tc>
+          <w:tcPr>
+            <w:tcW w:w="2160" w:type="dxa"/>
+            <w:tcBorders>
+              <w:top w:val="single" w:sz="4" w:space="0" w:color="000000"/>
+              <w:left w:val="single" w:sz="4" w:space="0" w:color="000000"/>
+              <w:bottom w:val="single" w:sz="4" w:space="0" w:color="000000"/>
+              <w:right w:val="single" w:sz="4" w:space="0" w:color="000000"/>
+            </w:tcBorders>
+            <w:vAlign w:val="center"/>
+          </w:tcPr>
+          <w:p>
+            <w:pPr>
+              <w:pStyle w:val="BodyText"/>
+              <w:suppressAutoHyphens w:val="true"/>
+              <w:spacing w:before="74" w:after="0"/>
+              <w:ind w:hanging="0" w:left="0"/>
+              <w:jc w:val="center"/>
+              <w:rPr>
+                <w:rFonts w:ascii="Arial" w:hAnsi="Arial"/>
+              </w:rPr>
+            </w:pPr>
+            <w:r>
+              <w:rPr>
+                <w:rFonts w:cs="" w:ascii="Arial" w:hAnsi="Arial"/>
+                <w:b/>
+                <w:bCs/>
+                <w:kern w:val="0"/>
+                <w:sz w:val="22"/>
+                <w:szCs w:val="22"/>
+                <w:lang w:val="it-IT" w:eastAsia="en-US" w:bidi="ar-SA"/>
+              </w:rPr>
+              <w:t>PREDISPONENTE</w:t>
+            </w:r>
+          </w:p>
+        </w:tc>
+        <w:tc>
+          <w:tcPr>
+            <w:tcW w:w="1913" w:type="dxa"/>
+            <w:tcBorders>
+              <w:top w:val="single" w:sz="4" w:space="0" w:color="000000"/>
+              <w:left w:val="single" w:sz="4" w:space="0" w:color="000000"/>
+              <w:bottom w:val="single" w:sz="4" w:space="0" w:color="000000"/>
+              <w:right w:val="single" w:sz="4" w:space="0" w:color="000000"/>
+            </w:tcBorders>
+            <w:vAlign w:val="center"/>
+          </w:tcPr>
+          <w:p>
+            <w:pPr>
+              <w:pStyle w:val="BodyText"/>
+              <w:suppressAutoHyphens w:val="true"/>
+              <w:spacing w:before="74" w:after="0"/>
+              <w:ind w:hanging="0" w:left="0"/>
+              <w:jc w:val="center"/>
+              <w:rPr>
+                <w:rFonts w:ascii="Arial" w:hAnsi="Arial"/>
+              </w:rPr>
+            </w:pPr>
+            <w:r>
+              <w:rPr>
+                <w:rFonts w:cs="" w:ascii="Arial" w:hAnsi="Arial"/>
+                <w:b/>
+                <w:bCs/>
+                <w:kern w:val="0"/>
+                <w:sz w:val="22"/>
+                <w:szCs w:val="22"/>
+                <w:lang w:val="it-IT" w:eastAsia="en-US" w:bidi="ar-SA"/>
+              </w:rPr>
+              <w:t>PAZIENTE</w:t>
+            </w:r>
+          </w:p>
+        </w:tc>
+        <w:tc>
+          <w:tcPr>
+            <w:tcW w:w="2438" w:type="dxa"/>
+            <w:tcBorders>
+              <w:top w:val="single" w:sz="4" w:space="0" w:color="000000"/>
+              <w:left w:val="single" w:sz="4" w:space="0" w:color="000000"/>
+              <w:bottom w:val="single" w:sz="4" w:space="0" w:color="000000"/>
+              <w:right w:val="single" w:sz="4" w:space="0" w:color="000000"/>
+            </w:tcBorders>
+            <w:vAlign w:val="center"/>
+          </w:tcPr>
+          <w:p>
+            <w:pPr>
+              <w:pStyle w:val="BodyText"/>
+              <w:suppressAutoHyphens w:val="true"/>
+              <w:spacing w:before="74" w:after="0"/>
+              <w:ind w:hanging="0" w:left="0"/>
+              <w:jc w:val="center"/>
+              <w:rPr>
+                <w:rFonts w:ascii="Arial" w:hAnsi="Arial"/>
+                <w:lang w:val="it-IT"/>
+              </w:rPr>
+            </w:pPr>
+            <w:r>
+              <w:rPr>
+                <w:rFonts w:ascii="Arial" w:hAnsi="Arial"/>
+                <w:lang w:val="it-IT"/>
+              </w:rPr>
+            </w:r>
+          </w:p>
+        </w:tc>
+      </w:tr>
+    </w:tbl>
     <w:p>
       <w:pPr>
         <w:pStyle w:val="Normal"/>
@@ -10681,11 +10982,11 @@
         <w:tblLook w:val="04a0" w:noHBand="0" w:noVBand="1" w:firstColumn="1" w:lastRow="0" w:lastColumn="0" w:firstRow="1"/>
       </w:tblPr>
       <w:tblGrid>
-        <w:gridCol w:w="1794"/>
+        <w:gridCol w:w="1791"/>
         <w:gridCol w:w="2427"/>
-        <w:gridCol w:w="2352"/>
-        <w:gridCol w:w="1344"/>
-        <w:gridCol w:w="2433"/>
+        <w:gridCol w:w="2355"/>
+        <w:gridCol w:w="1341"/>
+        <w:gridCol w:w="2436"/>
       </w:tblGrid>
       <w:tr>
         <w:trPr>
@@ -10693,7 +10994,7 @@
         </w:trPr>
         <w:tc>
           <w:tcPr>
-            <w:tcW w:w="1794" w:type="dxa"/>
+            <w:tcW w:w="1791" w:type="dxa"/>
             <w:tcBorders/>
             <w:shd w:color="auto" w:fill="808080" w:themeFill="background1" w:themeFillShade="80" w:val="clear"/>
           </w:tcPr>
@@ -10770,7 +11071,7 @@
         </w:tc>
         <w:tc>
           <w:tcPr>
-            <w:tcW w:w="2433" w:type="dxa"/>
+            <w:tcW w:w="2436" w:type="dxa"/>
             <w:tcBorders/>
             <w:shd w:color="auto" w:fill="808080" w:themeFill="background1" w:themeFillShade="80" w:val="clear"/>
           </w:tcPr>
@@ -10813,7 +11114,7 @@
         </w:trPr>
         <w:tc>
           <w:tcPr>
-            <w:tcW w:w="1794" w:type="dxa"/>
+            <w:tcW w:w="1791" w:type="dxa"/>
             <w:tcBorders/>
           </w:tcPr>
           <w:p>
@@ -10876,7 +11177,7 @@
         </w:tc>
         <w:tc>
           <w:tcPr>
-            <w:tcW w:w="2352" w:type="dxa"/>
+            <w:tcW w:w="2355" w:type="dxa"/>
             <w:tcBorders/>
           </w:tcPr>
           <w:p>
@@ -10915,7 +11216,7 @@
         </w:tc>
         <w:tc>
           <w:tcPr>
-            <w:tcW w:w="1344" w:type="dxa"/>
+            <w:tcW w:w="1341" w:type="dxa"/>
             <w:tcBorders/>
           </w:tcPr>
           <w:p>
@@ -10950,7 +11251,7 @@
         </w:tc>
         <w:tc>
           <w:tcPr>
-            <w:tcW w:w="2433" w:type="dxa"/>
+            <w:tcW w:w="2436" w:type="dxa"/>
             <w:tcBorders/>
           </w:tcPr>
           <w:p>
@@ -12800,10 +13101,10 @@
       </w:tblPr>
       <w:tblGrid>
         <w:gridCol w:w="2340"/>
-        <w:gridCol w:w="1434"/>
-        <w:gridCol w:w="2180"/>
-        <w:gridCol w:w="1348"/>
-        <w:gridCol w:w="3108"/>
+        <w:gridCol w:w="1431"/>
+        <w:gridCol w:w="2183"/>
+        <w:gridCol w:w="1345"/>
+        <w:gridCol w:w="3111"/>
       </w:tblGrid>
       <w:tr>
         <w:trPr>
@@ -12849,7 +13150,7 @@
         </w:tc>
         <w:tc>
           <w:tcPr>
-            <w:tcW w:w="4962" w:type="dxa"/>
+            <w:tcW w:w="4959" w:type="dxa"/>
             <w:gridSpan w:val="3"/>
             <w:tcBorders/>
             <w:shd w:color="auto" w:fill="808080" w:themeFill="background1" w:themeFillShade="80" w:val="clear"/>
@@ -12888,7 +13189,7 @@
         </w:tc>
         <w:tc>
           <w:tcPr>
-            <w:tcW w:w="3108" w:type="dxa"/>
+            <w:tcW w:w="3111" w:type="dxa"/>
             <w:tcBorders/>
             <w:shd w:color="auto" w:fill="808080" w:themeFill="background1" w:themeFillShade="80" w:val="clear"/>
           </w:tcPr>
@@ -12955,7 +13256,7 @@
         </w:tc>
         <w:tc>
           <w:tcPr>
-            <w:tcW w:w="1434" w:type="dxa"/>
+            <w:tcW w:w="1431" w:type="dxa"/>
             <w:tcBorders/>
           </w:tcPr>
           <w:p>
@@ -12990,7 +13291,7 @@
         </w:tc>
         <w:tc>
           <w:tcPr>
-            <w:tcW w:w="2180" w:type="dxa"/>
+            <w:tcW w:w="2183" w:type="dxa"/>
             <w:tcBorders/>
           </w:tcPr>
           <w:p>
@@ -13025,7 +13326,7 @@
         </w:tc>
         <w:tc>
           <w:tcPr>
-            <w:tcW w:w="1348" w:type="dxa"/>
+            <w:tcW w:w="1345" w:type="dxa"/>
             <w:tcBorders/>
           </w:tcPr>
           <w:p>
@@ -13060,7 +13361,7 @@
         </w:tc>
         <w:tc>
           <w:tcPr>
-            <w:tcW w:w="3108" w:type="dxa"/>
+            <w:tcW w:w="3111" w:type="dxa"/>
             <w:tcBorders/>
           </w:tcPr>
           <w:p>
@@ -13143,9 +13444,9 @@
       </w:tblPr>
       <w:tblGrid>
         <w:gridCol w:w="1621"/>
-        <w:gridCol w:w="2319"/>
-        <w:gridCol w:w="1621"/>
-        <w:gridCol w:w="2354"/>
+        <w:gridCol w:w="2318"/>
+        <w:gridCol w:w="1619"/>
+        <w:gridCol w:w="2357"/>
         <w:gridCol w:w="2518"/>
       </w:tblGrid>
       <w:tr>
@@ -13194,7 +13495,7 @@
         </w:tc>
         <w:tc>
           <w:tcPr>
-            <w:tcW w:w="2319" w:type="dxa"/>
+            <w:tcW w:w="2318" w:type="dxa"/>
             <w:tcBorders/>
             <w:shd w:color="auto" w:fill="808080" w:themeFill="background1" w:themeFillShade="80" w:val="clear"/>
           </w:tcPr>
@@ -13230,7 +13531,7 @@
         </w:tc>
         <w:tc>
           <w:tcPr>
-            <w:tcW w:w="6493" w:type="dxa"/>
+            <w:tcW w:w="6494" w:type="dxa"/>
             <w:gridSpan w:val="3"/>
             <w:tcBorders/>
             <w:shd w:color="auto" w:fill="808080" w:themeFill="background1" w:themeFillShade="80" w:val="clear"/>
@@ -13300,7 +13601,7 @@
         </w:tc>
         <w:tc>
           <w:tcPr>
-            <w:tcW w:w="2319" w:type="dxa"/>
+            <w:tcW w:w="2318" w:type="dxa"/>
             <w:tcBorders/>
           </w:tcPr>
           <w:p>
@@ -13324,7 +13625,7 @@
         </w:tc>
         <w:tc>
           <w:tcPr>
-            <w:tcW w:w="1621" w:type="dxa"/>
+            <w:tcW w:w="1619" w:type="dxa"/>
             <w:tcBorders/>
           </w:tcPr>
           <w:p>
@@ -13359,7 +13660,7 @@
         </w:tc>
         <w:tc>
           <w:tcPr>
-            <w:tcW w:w="2354" w:type="dxa"/>
+            <w:tcW w:w="2357" w:type="dxa"/>
             <w:tcBorders/>
           </w:tcPr>
           <w:p>
@@ -16478,7 +16779,9 @@
         </w:rPr>
       </w:pPr>
       <w:r>
-        <w:rPr/>
+        <w:rPr>
+          <w:lang w:val="it-IT"/>
+        </w:rPr>
       </w:r>
     </w:p>
     <w:p>
@@ -26360,7 +26663,7 @@
               <w:szCs w:val="16"/>
               <w:rFonts w:ascii="Arial" w:hAnsi="Arial"/>
             </w:rPr>
-            <w:t>8</w:t>
+            <w:t>9</w:t>
           </w:r>
           <w:r>
             <w:rPr>
@@ -26511,7 +26814,7 @@
               <w:szCs w:val="16"/>
               <w:rFonts w:ascii="Arial" w:hAnsi="Arial"/>
             </w:rPr>
-            <w:t>8</w:t>
+            <w:t>9</w:t>
           </w:r>
           <w:r>
             <w:rPr>

</xml_diff>